<commit_message>
Update Portfolio PDF with live Web Portfolio link
</commit_message>
<xml_diff>
--- a/Engr_Muhammad_Waqas_Portfolio.docx
+++ b/Engr_Muhammad_Waqas_Portfolio.docx
@@ -45,9 +45,21 @@
               <w:rPr>
                 <w:b/>
                 <w:color w:val="0D9488"/>
-                <w:sz w:val="21"/>
+                <w:sz w:val="19"/>
               </w:rPr>
               <w:t>COMPREHENSIVE ENGINEERING, BIM &amp; AI INNOVATION PORTFOLIO</w:t>
+            </w:r>
+          </w:p>
+          <w:p>
+            <w:pPr>
+              <w:spacing w:after="40"/>
+            </w:pPr>
+            <w:r>
+              <w:rPr>
+                <w:color w:val="475569"/>
+                <w:sz w:val="18"/>
+              </w:rPr>
+              <w:t>Rawalpindi, Pakistan   |   +92 345 5862998   |   engrwaqas034@gmail.com</w:t>
             </w:r>
           </w:p>
           <w:p>
@@ -56,12 +68,34 @@
             </w:pPr>
             <w:r>
               <w:rPr>
-                <w:color w:val="475569"/>
+                <w:b/>
+                <w:color w:val="0D9488"/>
                 <w:sz w:val="17"/>
               </w:rPr>
-              <w:t>Rawalpindi, Pakistan  |  +92 345 5862998  |  engrwaqas034@gmail.com</w:t>
-              <w:br/>
-              <w:t>LinkedIn: linkedin.com/in/muhammad-waqas-27b232214  |  GitHub: github.com/engrwaqas034-AI</w:t>
+              <w:t xml:space="preserve">Web Portfolio: </w:t>
+            </w:r>
+            <w:r>
+              <w:t xml:space="preserve">engrwaqas034-ai.github.io/Personal_Portfolio   |   </w:t>
+            </w:r>
+            <w:r>
+              <w:rPr>
+                <w:b/>
+                <w:sz w:val="17"/>
+              </w:rPr>
+              <w:t xml:space="preserve">LinkedIn: </w:t>
+            </w:r>
+            <w:r>
+              <w:t xml:space="preserve">linkedin.com/in/muhammad-waqas-27b232214   |   </w:t>
+            </w:r>
+            <w:r>
+              <w:rPr>
+                <w:b/>
+                <w:sz w:val="17"/>
+              </w:rPr>
+              <w:t xml:space="preserve">GitHub: </w:t>
+            </w:r>
+            <w:r>
+              <w:t>github.com/engrwaqas034-AI</w:t>
             </w:r>
           </w:p>
         </w:tc>
@@ -147,7 +181,7 @@
         <w:spacing w:after="160" w:line="276" w:lineRule="auto"/>
       </w:pPr>
       <w:r>
-        <w:t>Engr. Muhammad Waqas represents a new paradigm in the Built Environment: a Manager Estate (Technical) at REDAMCO (Ministry of Railways) and Senior Civil Engineer with 15+ years of hands-on field, infrastructure, and project management leadership who has systematically integrated Building Information Modeling (BIM / VDC), ISO 19650 Information Management, and Applied Artificial Intelligence (LLM &amp; Agentic Workflows). With a proven background bridging corporate railway asset monetization, client-side megaprojects (Pakistan Railways), GCC industrial mega-structures (Sohar Steel Mill Oman), and multi-story residential/commercial developments, Waqas designs, executes, and automates modern construction workflows.</w:t>
+        <w:t>Engr. Muhammad Waqas represents a new paradigm in the Built Environment: a Civil Engineer, Manager Estate (Technical) at REDAMCO (Ministry of Railways) and Senior Infrastructure Specialist with 15+ years of hands-on field, infrastructure, and project management leadership who has systematically integrated Building Information Modeling (BIM / VDC), ISO 19650 Information Management, and Applied Artificial Intelligence (LLM &amp; Agentic Workflows). With a proven background bridging corporate railway asset monetization, client-side megaprojects (Pakistan Railways), GCC industrial mega-structures (Sohar Steel Mill Oman), and multi-story residential/commercial developments, Waqas designs, executes, and automates modern construction workflows.</w:t>
       </w:r>
     </w:p>
     <w:p>

</xml_diff>